<commit_message>
feat: Implemented All Required Api-Endpoints
</commit_message>
<xml_diff>
--- a/documentation/Documentation.docx
+++ b/documentation/Documentation.docx
@@ -1005,7 +1005,15 @@
     </w:p>
     <w:p>
       <w:r>
-        <w:t xml:space="preserve">Die product_id ist </w:t>
+        <w:t xml:space="preserve">Die </w:t>
+      </w:r>
+      <w:proofErr w:type="spellStart"/>
+      <w:r>
+        <w:t>product_id</w:t>
+      </w:r>
+      <w:proofErr w:type="spellEnd"/>
+      <w:r>
+        <w:t xml:space="preserve"> ist </w:t>
       </w:r>
       <w:r>
         <w:t>der Primary Key des Produktes.</w:t>
@@ -1013,7 +1021,15 @@
     </w:p>
     <w:p>
       <w:r>
-        <w:t>Die sku ist die eindeutige Bezeichnung (Identifikationsbezeichnung) des Produktes.</w:t>
+        <w:t xml:space="preserve">Die </w:t>
+      </w:r>
+      <w:proofErr w:type="spellStart"/>
+      <w:r>
+        <w:t>sku</w:t>
+      </w:r>
+      <w:proofErr w:type="spellEnd"/>
+      <w:r>
+        <w:t xml:space="preserve"> ist die eindeutige Bezeichnung (Identifikationsbezeichnung) des Produktes.</w:t>
       </w:r>
     </w:p>
     <w:p>
@@ -1053,7 +1069,15 @@
     </w:p>
     <w:p>
       <w:r>
-        <w:t>Der Fremdschlüssel id_category ist eine direkte Verbindung, die darstellt welches Produkt zu welcher Kategorie gehört. Eine Kategorie kann mehreren Produkten zugeordnet werden.</w:t>
+        <w:t xml:space="preserve">Der Fremdschlüssel </w:t>
+      </w:r>
+      <w:proofErr w:type="spellStart"/>
+      <w:r>
+        <w:t>id_category</w:t>
+      </w:r>
+      <w:proofErr w:type="spellEnd"/>
+      <w:r>
+        <w:t xml:space="preserve"> ist eine direkte Verbindung, die darstellt welches Produkt zu welcher Kategorie gehört. Eine Kategorie kann mehreren Produkten zugeordnet werden.</w:t>
       </w:r>
     </w:p>
     <w:p>
@@ -1063,17 +1087,41 @@
     </w:p>
     <w:p>
       <w:r>
-        <w:t>Das image Attribut entspricht einem Bild, das per URL gespeichert wird.</w:t>
+        <w:t xml:space="preserve">Das </w:t>
+      </w:r>
+      <w:proofErr w:type="spellStart"/>
+      <w:r>
+        <w:t>image</w:t>
+      </w:r>
+      <w:proofErr w:type="spellEnd"/>
+      <w:r>
+        <w:t xml:space="preserve"> Attribut entspricht einem Bild, das per URL gespeichert wird.</w:t>
       </w:r>
     </w:p>
     <w:p>
       <w:r>
-        <w:t>Die description ist eine Produktbeschreibung.</w:t>
+        <w:t xml:space="preserve">Die </w:t>
+      </w:r>
+      <w:proofErr w:type="spellStart"/>
+      <w:r>
+        <w:t>description</w:t>
+      </w:r>
+      <w:proofErr w:type="spellEnd"/>
+      <w:r>
+        <w:t xml:space="preserve"> ist eine Produktbeschreibung.</w:t>
       </w:r>
     </w:p>
     <w:p>
       <w:r>
-        <w:t>Der price entspricht dem Produktpreis.</w:t>
+        <w:t xml:space="preserve">Der </w:t>
+      </w:r>
+      <w:proofErr w:type="spellStart"/>
+      <w:r>
+        <w:t>price</w:t>
+      </w:r>
+      <w:proofErr w:type="spellEnd"/>
+      <w:r>
+        <w:t xml:space="preserve"> entspricht dem Produktpreis.</w:t>
       </w:r>
     </w:p>
     <w:p>
@@ -1233,8 +1281,21 @@
           </w:tcPr>
           <w:p>
             <w:r>
-              <w:t>/api/v1/authenticate</w:t>
-            </w:r>
+              <w:t>/</w:t>
+            </w:r>
+            <w:proofErr w:type="spellStart"/>
+            <w:r>
+              <w:t>api</w:t>
+            </w:r>
+            <w:proofErr w:type="spellEnd"/>
+            <w:r>
+              <w:t>/v1/</w:t>
+            </w:r>
+            <w:proofErr w:type="spellStart"/>
+            <w:r>
+              <w:t>authenticate</w:t>
+            </w:r>
+            <w:proofErr w:type="spellEnd"/>
           </w:p>
         </w:tc>
         <w:tc>
@@ -1252,9 +1313,19 @@
             <w:tcW w:w="1461" w:type="dxa"/>
           </w:tcPr>
           <w:p>
-            <w:r>
-              <w:t>username, password</w:t>
-            </w:r>
+            <w:proofErr w:type="spellStart"/>
+            <w:r>
+              <w:t>username</w:t>
+            </w:r>
+            <w:proofErr w:type="spellEnd"/>
+            <w:r>
+              <w:t xml:space="preserve">, </w:t>
+            </w:r>
+            <w:proofErr w:type="spellStart"/>
+            <w:r>
+              <w:t>password</w:t>
+            </w:r>
+            <w:proofErr w:type="spellEnd"/>
           </w:p>
         </w:tc>
         <w:tc>
@@ -1285,14 +1356,24 @@
           </w:tcPr>
           <w:p>
             <w:r>
-              <w:t>/api/v1/</w:t>
-            </w:r>
+              <w:t>/</w:t>
+            </w:r>
+            <w:proofErr w:type="spellStart"/>
+            <w:r>
+              <w:t>api</w:t>
+            </w:r>
+            <w:proofErr w:type="spellEnd"/>
+            <w:r>
+              <w:t>/v1/</w:t>
+            </w:r>
+            <w:proofErr w:type="spellStart"/>
             <w:r>
               <w:t>un</w:t>
             </w:r>
             <w:r>
               <w:t>authenticate</w:t>
             </w:r>
+            <w:proofErr w:type="spellEnd"/>
           </w:p>
         </w:tc>
         <w:tc>
@@ -1343,8 +1424,21 @@
           </w:tcPr>
           <w:p>
             <w:r>
-              <w:t>/api/v1/products</w:t>
-            </w:r>
+              <w:t>/</w:t>
+            </w:r>
+            <w:proofErr w:type="spellStart"/>
+            <w:r>
+              <w:t>api</w:t>
+            </w:r>
+            <w:proofErr w:type="spellEnd"/>
+            <w:r>
+              <w:t>/v1/</w:t>
+            </w:r>
+            <w:proofErr w:type="spellStart"/>
+            <w:r>
+              <w:t>products</w:t>
+            </w:r>
+            <w:proofErr w:type="spellEnd"/>
           </w:p>
         </w:tc>
         <w:tc>
@@ -1395,13 +1489,37 @@
           </w:tcPr>
           <w:p>
             <w:r>
-              <w:t>/api/v1/product/</w:t>
+              <w:t>/</w:t>
+            </w:r>
+            <w:proofErr w:type="spellStart"/>
+            <w:r>
+              <w:t>api</w:t>
+            </w:r>
+            <w:proofErr w:type="spellEnd"/>
+            <w:r>
+              <w:t>/v1/</w:t>
+            </w:r>
+            <w:proofErr w:type="spellStart"/>
+            <w:r>
+              <w:t>product</w:t>
+            </w:r>
+            <w:proofErr w:type="spellEnd"/>
+            <w:r>
+              <w:t>/</w:t>
             </w:r>
             <w:r>
               <w:t>{</w:t>
             </w:r>
             <w:r>
-              <w:t xml:space="preserve"> sku </w:t>
+              <w:t xml:space="preserve"> </w:t>
+            </w:r>
+            <w:proofErr w:type="spellStart"/>
+            <w:r>
+              <w:t>sku</w:t>
+            </w:r>
+            <w:proofErr w:type="spellEnd"/>
+            <w:r>
+              <w:t xml:space="preserve"> </w:t>
             </w:r>
             <w:r>
               <w:t>}</w:t>
@@ -1423,11 +1541,45 @@
             <w:tcW w:w="1461" w:type="dxa"/>
           </w:tcPr>
           <w:p>
+            <w:proofErr w:type="spellStart"/>
             <w:r>
               <w:t>sku</w:t>
             </w:r>
-            <w:r>
-              <w:t>, active, id_category, name, image, description, price, stock</w:t>
+            <w:proofErr w:type="spellEnd"/>
+            <w:r>
+              <w:t xml:space="preserve">, active, </w:t>
+            </w:r>
+            <w:proofErr w:type="spellStart"/>
+            <w:r>
+              <w:t>id_category</w:t>
+            </w:r>
+            <w:proofErr w:type="spellEnd"/>
+            <w:r>
+              <w:t xml:space="preserve">, name, </w:t>
+            </w:r>
+            <w:proofErr w:type="spellStart"/>
+            <w:r>
+              <w:t>image</w:t>
+            </w:r>
+            <w:proofErr w:type="spellEnd"/>
+            <w:r>
+              <w:t xml:space="preserve">, </w:t>
+            </w:r>
+            <w:proofErr w:type="spellStart"/>
+            <w:r>
+              <w:t>description</w:t>
+            </w:r>
+            <w:proofErr w:type="spellEnd"/>
+            <w:r>
+              <w:t xml:space="preserve">, </w:t>
+            </w:r>
+            <w:proofErr w:type="spellStart"/>
+            <w:r>
+              <w:t>price</w:t>
+            </w:r>
+            <w:proofErr w:type="spellEnd"/>
+            <w:r>
+              <w:t>, stock</w:t>
             </w:r>
           </w:p>
         </w:tc>
@@ -1459,14 +1611,32 @@
           </w:tcPr>
           <w:p>
             <w:r>
-              <w:t>/api/v1/product/</w:t>
+              <w:t>/</w:t>
+            </w:r>
+            <w:proofErr w:type="spellStart"/>
+            <w:r>
+              <w:t>api</w:t>
+            </w:r>
+            <w:proofErr w:type="spellEnd"/>
+            <w:r>
+              <w:t>/v1/</w:t>
+            </w:r>
+            <w:proofErr w:type="spellStart"/>
+            <w:r>
+              <w:t>product</w:t>
+            </w:r>
+            <w:proofErr w:type="spellEnd"/>
+            <w:r>
+              <w:t>/</w:t>
             </w:r>
             <w:r>
               <w:t>{</w:t>
             </w:r>
+            <w:proofErr w:type="spellStart"/>
             <w:r>
               <w:t>sku</w:t>
             </w:r>
+            <w:proofErr w:type="spellEnd"/>
             <w:r>
               <w:t>}</w:t>
             </w:r>
@@ -1487,9 +1657,11 @@
             <w:tcW w:w="1461" w:type="dxa"/>
           </w:tcPr>
           <w:p>
+            <w:proofErr w:type="spellStart"/>
             <w:r>
               <w:t>sku</w:t>
             </w:r>
+            <w:proofErr w:type="spellEnd"/>
           </w:p>
         </w:tc>
         <w:tc>
@@ -1522,14 +1694,35 @@
             <w:r>
               <w:t>/</w:t>
             </w:r>
-            <w:r>
-              <w:t>api/v1/product/</w:t>
+            <w:proofErr w:type="spellStart"/>
+            <w:r>
+              <w:t>api</w:t>
+            </w:r>
+            <w:proofErr w:type="spellEnd"/>
+            <w:r>
+              <w:t>/v1/</w:t>
+            </w:r>
+            <w:proofErr w:type="spellStart"/>
+            <w:r>
+              <w:t>product</w:t>
+            </w:r>
+            <w:proofErr w:type="spellEnd"/>
+            <w:r>
+              <w:t>/</w:t>
             </w:r>
             <w:r>
               <w:t>{</w:t>
             </w:r>
             <w:r>
-              <w:t xml:space="preserve"> sku </w:t>
+              <w:t xml:space="preserve"> </w:t>
+            </w:r>
+            <w:proofErr w:type="spellStart"/>
+            <w:r>
+              <w:t>sku</w:t>
+            </w:r>
+            <w:proofErr w:type="spellEnd"/>
+            <w:r>
+              <w:t xml:space="preserve"> </w:t>
             </w:r>
             <w:r>
               <w:t>}</w:t>
@@ -1551,9 +1744,11 @@
             <w:tcW w:w="1461" w:type="dxa"/>
           </w:tcPr>
           <w:p>
+            <w:proofErr w:type="spellStart"/>
             <w:r>
               <w:t>sku</w:t>
             </w:r>
+            <w:proofErr w:type="spellEnd"/>
           </w:p>
         </w:tc>
         <w:tc>
@@ -1584,8 +1779,21 @@
           </w:tcPr>
           <w:p>
             <w:r>
-              <w:t>/api/v1/categories</w:t>
-            </w:r>
+              <w:t>/</w:t>
+            </w:r>
+            <w:proofErr w:type="spellStart"/>
+            <w:r>
+              <w:t>api</w:t>
+            </w:r>
+            <w:proofErr w:type="spellEnd"/>
+            <w:r>
+              <w:t>/v1/</w:t>
+            </w:r>
+            <w:proofErr w:type="spellStart"/>
+            <w:r>
+              <w:t>categories</w:t>
+            </w:r>
+            <w:proofErr w:type="spellEnd"/>
           </w:p>
         </w:tc>
         <w:tc>
@@ -1636,8 +1844,21 @@
           </w:tcPr>
           <w:p>
             <w:r>
-              <w:t>/api/v1/category</w:t>
-            </w:r>
+              <w:t>/</w:t>
+            </w:r>
+            <w:proofErr w:type="spellStart"/>
+            <w:r>
+              <w:t>api</w:t>
+            </w:r>
+            <w:proofErr w:type="spellEnd"/>
+            <w:r>
+              <w:t>/v1/</w:t>
+            </w:r>
+            <w:proofErr w:type="spellStart"/>
+            <w:r>
+              <w:t>category</w:t>
+            </w:r>
+            <w:proofErr w:type="spellEnd"/>
           </w:p>
         </w:tc>
         <w:tc>
@@ -1728,7 +1949,23 @@
           </w:tcPr>
           <w:p>
             <w:r>
-              <w:t>/api/v1/category/</w:t>
+              <w:t>/</w:t>
+            </w:r>
+            <w:proofErr w:type="spellStart"/>
+            <w:r>
+              <w:t>api</w:t>
+            </w:r>
+            <w:proofErr w:type="spellEnd"/>
+            <w:r>
+              <w:t>/v1/</w:t>
+            </w:r>
+            <w:proofErr w:type="spellStart"/>
+            <w:r>
+              <w:t>category</w:t>
+            </w:r>
+            <w:proofErr w:type="spellEnd"/>
+            <w:r>
+              <w:t>/</w:t>
             </w:r>
             <w:r>
               <w:t>{category_id}</w:t>
@@ -1788,7 +2025,23 @@
           </w:tcPr>
           <w:p>
             <w:r>
-              <w:t>/api/v1/category/</w:t>
+              <w:t>/</w:t>
+            </w:r>
+            <w:proofErr w:type="spellStart"/>
+            <w:r>
+              <w:t>api</w:t>
+            </w:r>
+            <w:proofErr w:type="spellEnd"/>
+            <w:r>
+              <w:t>/v1/</w:t>
+            </w:r>
+            <w:proofErr w:type="spellStart"/>
+            <w:r>
+              <w:t>category</w:t>
+            </w:r>
+            <w:proofErr w:type="spellEnd"/>
+            <w:r>
+              <w:t>/</w:t>
             </w:r>
             <w:r>
               <w:t>{category_id}</w:t>
@@ -1846,7 +2099,23 @@
           </w:tcPr>
           <w:p>
             <w:r>
-              <w:t>/api/v1/category/</w:t>
+              <w:t>/</w:t>
+            </w:r>
+            <w:proofErr w:type="spellStart"/>
+            <w:r>
+              <w:t>api</w:t>
+            </w:r>
+            <w:proofErr w:type="spellEnd"/>
+            <w:r>
+              <w:t>/v1/</w:t>
+            </w:r>
+            <w:proofErr w:type="spellStart"/>
+            <w:r>
+              <w:t>category</w:t>
+            </w:r>
+            <w:proofErr w:type="spellEnd"/>
+            <w:r>
+              <w:t>/</w:t>
             </w:r>
             <w:r>
               <w:t>{categor</w:t>
@@ -2143,7 +2412,15 @@
               <w:t>PHP-Services</w:t>
             </w:r>
             <w:r>
-              <w:t xml:space="preserve"> auf. Am ende Implementierte ich noch die Datenbank Verbindung.</w:t>
+              <w:t xml:space="preserve"> auf. Am </w:t>
+            </w:r>
+            <w:proofErr w:type="spellStart"/>
+            <w:r>
+              <w:t>ende</w:t>
+            </w:r>
+            <w:proofErr w:type="spellEnd"/>
+            <w:r>
+              <w:t xml:space="preserve"> Implementierte ich noch die Datenbank Verbindung.</w:t>
             </w:r>
           </w:p>
         </w:tc>
@@ -2175,7 +2452,35 @@
                 <w:rPr>
                   <w:rStyle w:val="Hyperlink"/>
                 </w:rPr>
-                <w:t>PHP: mysqli::$insert_id - Manual</w:t>
+                <w:t xml:space="preserve">PHP: </w:t>
+              </w:r>
+              <w:proofErr w:type="spellStart"/>
+              <w:r>
+                <w:rPr>
+                  <w:rStyle w:val="Hyperlink"/>
+                </w:rPr>
+                <w:t>mysqli</w:t>
+              </w:r>
+              <w:proofErr w:type="spellEnd"/>
+              <w:r>
+                <w:rPr>
+                  <w:rStyle w:val="Hyperlink"/>
+                </w:rPr>
+                <w:t>::$</w:t>
+              </w:r>
+              <w:proofErr w:type="spellStart"/>
+              <w:r>
+                <w:rPr>
+                  <w:rStyle w:val="Hyperlink"/>
+                </w:rPr>
+                <w:t>insert_id</w:t>
+              </w:r>
+              <w:proofErr w:type="spellEnd"/>
+              <w:r>
+                <w:rPr>
+                  <w:rStyle w:val="Hyperlink"/>
+                </w:rPr>
+                <w:t xml:space="preserve"> - Manual</w:t>
               </w:r>
             </w:hyperlink>
           </w:p>
@@ -2192,7 +2497,23 @@
                   <w:rStyle w:val="Hyperlink"/>
                   <w:lang w:val="en-CH"/>
                 </w:rPr>
-                <w:t>PHP-Cheatsheet (F4).pdf</w:t>
+                <w:t>PHP-</w:t>
+              </w:r>
+              <w:proofErr w:type="spellStart"/>
+              <w:r>
+                <w:rPr>
+                  <w:rStyle w:val="Hyperlink"/>
+                  <w:lang w:val="en-CH"/>
+                </w:rPr>
+                <w:t>Cheatsheet</w:t>
+              </w:r>
+              <w:proofErr w:type="spellEnd"/>
+              <w:r>
+                <w:rPr>
+                  <w:rStyle w:val="Hyperlink"/>
+                  <w:lang w:val="en-CH"/>
+                </w:rPr>
+                <w:t xml:space="preserve"> (F4).pdf</w:t>
               </w:r>
             </w:hyperlink>
           </w:p>
@@ -2408,7 +2729,15 @@
           </w:tcPr>
           <w:p>
             <w:r>
-              <w:t>Basic Data-Struktur aufsetzen und leere PHP files createn.</w:t>
+              <w:t xml:space="preserve">Basic Data-Struktur aufsetzen und leere PHP </w:t>
+            </w:r>
+            <w:proofErr w:type="spellStart"/>
+            <w:r>
+              <w:t>files</w:t>
+            </w:r>
+            <w:proofErr w:type="spellEnd"/>
+            <w:r>
+              <w:t xml:space="preserve"> createn.</w:t>
             </w:r>
           </w:p>
         </w:tc>
@@ -2430,7 +2759,15 @@
           </w:tcPr>
           <w:p>
             <w:r>
-              <w:t>Eigene JWT-NotFound Exception bauen für besseres Exception Handling.</w:t>
+              <w:t>Eigene JWT-</w:t>
+            </w:r>
+            <w:proofErr w:type="spellStart"/>
+            <w:r>
+              <w:t>NotFound</w:t>
+            </w:r>
+            <w:proofErr w:type="spellEnd"/>
+            <w:r>
+              <w:t xml:space="preserve"> Exception bauen für besseres Exception Handling.</w:t>
             </w:r>
           </w:p>
         </w:tc>
@@ -2520,35 +2857,163 @@
                   <w:b/>
                   <w:bCs/>
                 </w:rPr>
-                <w:t>PHP Custom Exception Class: Creating and throwing custom exceptions</w:t>
-              </w:r>
-            </w:hyperlink>
-          </w:p>
-          <w:p>
-            <w:pPr>
-              <w:rPr>
-                <w:b/>
-                <w:bCs/>
-              </w:rPr>
-            </w:pPr>
-            <w:hyperlink r:id="rId18" w:history="1">
+                <w:t xml:space="preserve">PHP Custom Exception Class: </w:t>
+              </w:r>
+              <w:proofErr w:type="spellStart"/>
               <w:r>
                 <w:rPr>
                   <w:rStyle w:val="Hyperlink"/>
                   <w:b/>
                   <w:bCs/>
                 </w:rPr>
-                <w:t>PHP Extending Exceptions</w:t>
-              </w:r>
+                <w:t>Creating</w:t>
+              </w:r>
+              <w:proofErr w:type="spellEnd"/>
+              <w:r>
+                <w:rPr>
+                  <w:rStyle w:val="Hyperlink"/>
+                  <w:b/>
+                  <w:bCs/>
+                </w:rPr>
+                <w:t xml:space="preserve"> and </w:t>
+              </w:r>
+              <w:proofErr w:type="spellStart"/>
+              <w:r>
+                <w:rPr>
+                  <w:rStyle w:val="Hyperlink"/>
+                  <w:b/>
+                  <w:bCs/>
+                </w:rPr>
+                <w:t>throwing</w:t>
+              </w:r>
+              <w:proofErr w:type="spellEnd"/>
+              <w:r>
+                <w:rPr>
+                  <w:rStyle w:val="Hyperlink"/>
+                  <w:b/>
+                  <w:bCs/>
+                </w:rPr>
+                <w:t xml:space="preserve"> </w:t>
+              </w:r>
+              <w:proofErr w:type="spellStart"/>
+              <w:r>
+                <w:rPr>
+                  <w:rStyle w:val="Hyperlink"/>
+                  <w:b/>
+                  <w:bCs/>
+                </w:rPr>
+                <w:t>custom</w:t>
+              </w:r>
+              <w:proofErr w:type="spellEnd"/>
+              <w:r>
+                <w:rPr>
+                  <w:rStyle w:val="Hyperlink"/>
+                  <w:b/>
+                  <w:bCs/>
+                </w:rPr>
+                <w:t xml:space="preserve"> </w:t>
+              </w:r>
+              <w:proofErr w:type="spellStart"/>
+              <w:r>
+                <w:rPr>
+                  <w:rStyle w:val="Hyperlink"/>
+                  <w:b/>
+                  <w:bCs/>
+                </w:rPr>
+                <w:t>exceptions</w:t>
+              </w:r>
+              <w:proofErr w:type="spellEnd"/>
             </w:hyperlink>
           </w:p>
           <w:p>
+            <w:pPr>
+              <w:rPr>
+                <w:b/>
+                <w:bCs/>
+              </w:rPr>
+            </w:pPr>
+            <w:hyperlink r:id="rId18" w:history="1">
+              <w:r>
+                <w:rPr>
+                  <w:rStyle w:val="Hyperlink"/>
+                  <w:b/>
+                  <w:bCs/>
+                </w:rPr>
+                <w:t xml:space="preserve">PHP </w:t>
+              </w:r>
+              <w:proofErr w:type="spellStart"/>
+              <w:r>
+                <w:rPr>
+                  <w:rStyle w:val="Hyperlink"/>
+                  <w:b/>
+                  <w:bCs/>
+                </w:rPr>
+                <w:t>Extending</w:t>
+              </w:r>
+              <w:proofErr w:type="spellEnd"/>
+              <w:r>
+                <w:rPr>
+                  <w:rStyle w:val="Hyperlink"/>
+                  <w:b/>
+                  <w:bCs/>
+                </w:rPr>
+                <w:t xml:space="preserve"> </w:t>
+              </w:r>
+              <w:proofErr w:type="spellStart"/>
+              <w:r>
+                <w:rPr>
+                  <w:rStyle w:val="Hyperlink"/>
+                  <w:b/>
+                  <w:bCs/>
+                </w:rPr>
+                <w:t>Exceptions</w:t>
+              </w:r>
+              <w:proofErr w:type="spellEnd"/>
+            </w:hyperlink>
+          </w:p>
+          <w:p>
             <w:hyperlink r:id="rId19" w:tgtFrame="_blank" w:tooltip="https://www.php-fig.org/psr/psr-15/" w:history="1">
+              <w:proofErr w:type="spellStart"/>
               <w:r>
                 <w:rPr>
                   <w:rStyle w:val="Hyperlink"/>
                 </w:rPr>
-                <w:t>Decode JWT Token php Example — Code &amp; Guide</w:t>
+                <w:t>Decode</w:t>
+              </w:r>
+              <w:proofErr w:type="spellEnd"/>
+              <w:r>
+                <w:rPr>
+                  <w:rStyle w:val="Hyperlink"/>
+                </w:rPr>
+                <w:t xml:space="preserve"> JWT Token </w:t>
+              </w:r>
+              <w:proofErr w:type="spellStart"/>
+              <w:r>
+                <w:rPr>
+                  <w:rStyle w:val="Hyperlink"/>
+                </w:rPr>
+                <w:t>php</w:t>
+              </w:r>
+              <w:proofErr w:type="spellEnd"/>
+              <w:r>
+                <w:rPr>
+                  <w:rStyle w:val="Hyperlink"/>
+                </w:rPr>
+                <w:t xml:space="preserve"> </w:t>
+              </w:r>
+              <w:proofErr w:type="spellStart"/>
+              <w:r>
+                <w:rPr>
+                  <w:rStyle w:val="Hyperlink"/>
+                </w:rPr>
+                <w:t>Example</w:t>
+              </w:r>
+              <w:proofErr w:type="spellEnd"/>
+              <w:r>
+                <w:rPr>
+                  <w:rStyle w:val="Hyperlink"/>
+                </w:rPr>
+                <w:t xml:space="preserve"> — Code &amp; Guide</w:t>
               </w:r>
             </w:hyperlink>
           </w:p>
@@ -2863,8 +3328,44 @@
                 <w:rPr>
                   <w:rStyle w:val="Hyperlink"/>
                 </w:rPr>
-                <w:t>Exception Handling | firebase/php-jwt | DeepWiki</w:t>
-              </w:r>
+                <w:t xml:space="preserve">Exception Handling | </w:t>
+              </w:r>
+              <w:proofErr w:type="spellStart"/>
+              <w:r>
+                <w:rPr>
+                  <w:rStyle w:val="Hyperlink"/>
+                </w:rPr>
+                <w:t>firebase</w:t>
+              </w:r>
+              <w:proofErr w:type="spellEnd"/>
+              <w:r>
+                <w:rPr>
+                  <w:rStyle w:val="Hyperlink"/>
+                </w:rPr>
+                <w:t>/</w:t>
+              </w:r>
+              <w:proofErr w:type="spellStart"/>
+              <w:r>
+                <w:rPr>
+                  <w:rStyle w:val="Hyperlink"/>
+                </w:rPr>
+                <w:t>php-jwt</w:t>
+              </w:r>
+              <w:proofErr w:type="spellEnd"/>
+              <w:r>
+                <w:rPr>
+                  <w:rStyle w:val="Hyperlink"/>
+                </w:rPr>
+                <w:t xml:space="preserve"> | </w:t>
+              </w:r>
+              <w:proofErr w:type="spellStart"/>
+              <w:r>
+                <w:rPr>
+                  <w:rStyle w:val="Hyperlink"/>
+                </w:rPr>
+                <w:t>DeepWiki</w:t>
+              </w:r>
+              <w:proofErr w:type="spellEnd"/>
             </w:hyperlink>
           </w:p>
         </w:tc>
@@ -3039,7 +3540,7 @@
           </w:tcPr>
           <w:p>
             <w:r>
-              <w:t>4</w:t>
+              <w:t>2</w:t>
             </w:r>
             <w:r>
               <w:t>.0</w:t>
@@ -3064,7 +3565,10 @@
           </w:tcPr>
           <w:p>
             <w:r>
-              <w:t>2.5</w:t>
+              <w:t>1</w:t>
+            </w:r>
+            <w:r>
+              <w:t>.5</w:t>
             </w:r>
           </w:p>
         </w:tc>
@@ -3072,6 +3576,28 @@
       <w:tr>
         <w:tc>
           <w:tcPr>
+            <w:tcW w:w="4531" w:type="dxa"/>
+          </w:tcPr>
+          <w:p>
+            <w:r>
+              <w:t>Product API-Endpunkte Implementieren und mit OpenAPI Dokumentieren</w:t>
+            </w:r>
+          </w:p>
+        </w:tc>
+        <w:tc>
+          <w:tcPr>
+            <w:tcW w:w="4531" w:type="dxa"/>
+          </w:tcPr>
+          <w:p>
+            <w:r>
+              <w:t>5.0</w:t>
+            </w:r>
+          </w:p>
+        </w:tc>
+      </w:tr>
+      <w:tr>
+        <w:tc>
+          <w:tcPr>
             <w:tcW w:w="9062" w:type="dxa"/>
             <w:gridSpan w:val="2"/>
           </w:tcPr>
@@ -3087,7 +3613,11 @@
               <w:t>:</w:t>
             </w:r>
           </w:p>
-          <w:p/>
+          <w:p>
+            <w:r>
+              <w:t>Es war ein Sehr erfolgreichen Tag, Das meiste des Projekts wurde abgeschlossen sodass am letzten Projekt tag nur noch die Dokumentation angepasst werden muss.</w:t>
+            </w:r>
+          </w:p>
         </w:tc>
       </w:tr>
       <w:tr>
@@ -3114,9 +3644,6 @@
           <w:p>
             <w:pPr>
               <w:keepNext/>
-              <w:rPr>
-                <w:lang w:val="en-CH"/>
-              </w:rPr>
             </w:pPr>
             <w:hyperlink r:id="rId21" w:history="1">
               <w:r>
@@ -3125,6 +3652,36 @@
                   <w:lang w:val="en-CH"/>
                 </w:rPr>
                 <w:t>OpenAPI-Dokumentation.pdf</w:t>
+              </w:r>
+            </w:hyperlink>
+          </w:p>
+          <w:p>
+            <w:pPr>
+              <w:keepNext/>
+              <w:rPr>
+                <w:lang w:val="en-CH"/>
+              </w:rPr>
+            </w:pPr>
+            <w:hyperlink r:id="rId22" w:history="1">
+              <w:r>
+                <w:rPr>
+                  <w:rStyle w:val="Hyperlink"/>
+                </w:rPr>
+                <w:t xml:space="preserve">PHP: </w:t>
+              </w:r>
+              <w:proofErr w:type="spellStart"/>
+              <w:r>
+                <w:rPr>
+                  <w:rStyle w:val="Hyperlink"/>
+                </w:rPr>
+                <w:t>round</w:t>
+              </w:r>
+              <w:proofErr w:type="spellEnd"/>
+              <w:r>
+                <w:rPr>
+                  <w:rStyle w:val="Hyperlink"/>
+                </w:rPr>
+                <w:t xml:space="preserve"> - Manual</w:t>
               </w:r>
             </w:hyperlink>
           </w:p>
@@ -3754,12 +4311,40 @@
             <w:tcW w:w="4673" w:type="dxa"/>
           </w:tcPr>
           <w:p>
-            <w:hyperlink r:id="rId22" w:tgtFrame="_blank" w:tooltip="https://www.php.net/manual/en/mysqli.insert-id.php" w:history="1">
+            <w:hyperlink r:id="rId23" w:tgtFrame="_blank" w:tooltip="https://www.php.net/manual/en/mysqli.insert-id.php" w:history="1">
               <w:r>
                 <w:rPr>
                   <w:rStyle w:val="Hyperlink"/>
                 </w:rPr>
-                <w:t>PHP: mysqli::$insert_id - Manual</w:t>
+                <w:t xml:space="preserve">PHP: </w:t>
+              </w:r>
+              <w:proofErr w:type="spellStart"/>
+              <w:r>
+                <w:rPr>
+                  <w:rStyle w:val="Hyperlink"/>
+                </w:rPr>
+                <w:t>mysqli</w:t>
+              </w:r>
+              <w:proofErr w:type="spellEnd"/>
+              <w:r>
+                <w:rPr>
+                  <w:rStyle w:val="Hyperlink"/>
+                </w:rPr>
+                <w:t>::$</w:t>
+              </w:r>
+              <w:proofErr w:type="spellStart"/>
+              <w:r>
+                <w:rPr>
+                  <w:rStyle w:val="Hyperlink"/>
+                </w:rPr>
+                <w:t>insert_id</w:t>
+              </w:r>
+              <w:proofErr w:type="spellEnd"/>
+              <w:r>
+                <w:rPr>
+                  <w:rStyle w:val="Hyperlink"/>
+                </w:rPr>
+                <w:t xml:space="preserve"> - Manual</w:t>
               </w:r>
             </w:hyperlink>
           </w:p>
@@ -3769,9 +4354,19 @@
             <w:tcW w:w="4536" w:type="dxa"/>
           </w:tcPr>
           <w:p>
-            <w:r>
-              <w:t>auto_increment erstellte daten bekommen von mysqli</w:t>
-            </w:r>
+            <w:proofErr w:type="spellStart"/>
+            <w:r>
+              <w:t>auto_increment</w:t>
+            </w:r>
+            <w:proofErr w:type="spellEnd"/>
+            <w:r>
+              <w:t xml:space="preserve"> erstellte daten bekommen von </w:t>
+            </w:r>
+            <w:proofErr w:type="spellStart"/>
+            <w:r>
+              <w:t>mysqli</w:t>
+            </w:r>
+            <w:proofErr w:type="spellEnd"/>
           </w:p>
         </w:tc>
       </w:tr>
@@ -3781,13 +4376,35 @@
             <w:tcW w:w="4673" w:type="dxa"/>
           </w:tcPr>
           <w:p>
-            <w:hyperlink r:id="rId23" w:history="1">
+            <w:hyperlink r:id="rId24" w:history="1">
               <w:r>
                 <w:rPr>
                   <w:rStyle w:val="Hyperlink"/>
                 </w:rPr>
-                <w:t>PHP Extending Exceptions</w:t>
-              </w:r>
+                <w:t xml:space="preserve">PHP </w:t>
+              </w:r>
+              <w:proofErr w:type="spellStart"/>
+              <w:r>
+                <w:rPr>
+                  <w:rStyle w:val="Hyperlink"/>
+                </w:rPr>
+                <w:t>Extending</w:t>
+              </w:r>
+              <w:proofErr w:type="spellEnd"/>
+              <w:r>
+                <w:rPr>
+                  <w:rStyle w:val="Hyperlink"/>
+                </w:rPr>
+                <w:t xml:space="preserve"> </w:t>
+              </w:r>
+              <w:proofErr w:type="spellStart"/>
+              <w:r>
+                <w:rPr>
+                  <w:rStyle w:val="Hyperlink"/>
+                </w:rPr>
+                <w:t>Exceptions</w:t>
+              </w:r>
+              <w:proofErr w:type="spellEnd"/>
             </w:hyperlink>
           </w:p>
         </w:tc>
@@ -3808,12 +4425,48 @@
             <w:tcW w:w="4673" w:type="dxa"/>
           </w:tcPr>
           <w:p>
-            <w:hyperlink r:id="rId24" w:tgtFrame="_blank" w:tooltip="https://www.php-fig.org/psr/psr-15/" w:history="1">
+            <w:hyperlink r:id="rId25" w:tgtFrame="_blank" w:tooltip="https://www.php-fig.org/psr/psr-15/" w:history="1">
+              <w:proofErr w:type="spellStart"/>
               <w:r>
                 <w:rPr>
                   <w:rStyle w:val="Hyperlink"/>
                 </w:rPr>
-                <w:t>Decode JWT Token php Example — Code &amp; Guide</w:t>
+                <w:t>Decode</w:t>
+              </w:r>
+              <w:proofErr w:type="spellEnd"/>
+              <w:r>
+                <w:rPr>
+                  <w:rStyle w:val="Hyperlink"/>
+                </w:rPr>
+                <w:t xml:space="preserve"> JWT Token </w:t>
+              </w:r>
+              <w:proofErr w:type="spellStart"/>
+              <w:r>
+                <w:rPr>
+                  <w:rStyle w:val="Hyperlink"/>
+                </w:rPr>
+                <w:t>php</w:t>
+              </w:r>
+              <w:proofErr w:type="spellEnd"/>
+              <w:r>
+                <w:rPr>
+                  <w:rStyle w:val="Hyperlink"/>
+                </w:rPr>
+                <w:t xml:space="preserve"> </w:t>
+              </w:r>
+              <w:proofErr w:type="spellStart"/>
+              <w:r>
+                <w:rPr>
+                  <w:rStyle w:val="Hyperlink"/>
+                </w:rPr>
+                <w:t>Example</w:t>
+              </w:r>
+              <w:proofErr w:type="spellEnd"/>
+              <w:r>
+                <w:rPr>
+                  <w:rStyle w:val="Hyperlink"/>
+                </w:rPr>
+                <w:t xml:space="preserve"> — Code &amp; Guide</w:t>
               </w:r>
             </w:hyperlink>
           </w:p>
@@ -3824,7 +4477,15 @@
           </w:tcPr>
           <w:p>
             <w:r>
-              <w:t>Wie man JWT Decoden kann + mit Middleware</w:t>
+              <w:t xml:space="preserve">Wie man JWT </w:t>
+            </w:r>
+            <w:proofErr w:type="spellStart"/>
+            <w:r>
+              <w:t>Decoden</w:t>
+            </w:r>
+            <w:proofErr w:type="spellEnd"/>
+            <w:r>
+              <w:t xml:space="preserve"> kann + mit Middleware</w:t>
             </w:r>
           </w:p>
         </w:tc>
@@ -3835,13 +4496,63 @@
             <w:tcW w:w="4673" w:type="dxa"/>
           </w:tcPr>
           <w:p>
-            <w:hyperlink r:id="rId25" w:history="1">
+            <w:hyperlink r:id="rId26" w:history="1">
               <w:r>
                 <w:rPr>
                   <w:rStyle w:val="Hyperlink"/>
                 </w:rPr>
-                <w:t>PHP Custom Exception Class: Creating and throwing custom exceptions</w:t>
-              </w:r>
+                <w:t xml:space="preserve">PHP Custom Exception Class: </w:t>
+              </w:r>
+              <w:proofErr w:type="spellStart"/>
+              <w:r>
+                <w:rPr>
+                  <w:rStyle w:val="Hyperlink"/>
+                </w:rPr>
+                <w:t>Creating</w:t>
+              </w:r>
+              <w:proofErr w:type="spellEnd"/>
+              <w:r>
+                <w:rPr>
+                  <w:rStyle w:val="Hyperlink"/>
+                </w:rPr>
+                <w:t xml:space="preserve"> and </w:t>
+              </w:r>
+              <w:proofErr w:type="spellStart"/>
+              <w:r>
+                <w:rPr>
+                  <w:rStyle w:val="Hyperlink"/>
+                </w:rPr>
+                <w:t>throwing</w:t>
+              </w:r>
+              <w:proofErr w:type="spellEnd"/>
+              <w:r>
+                <w:rPr>
+                  <w:rStyle w:val="Hyperlink"/>
+                </w:rPr>
+                <w:t xml:space="preserve"> </w:t>
+              </w:r>
+              <w:proofErr w:type="spellStart"/>
+              <w:r>
+                <w:rPr>
+                  <w:rStyle w:val="Hyperlink"/>
+                </w:rPr>
+                <w:t>custom</w:t>
+              </w:r>
+              <w:proofErr w:type="spellEnd"/>
+              <w:r>
+                <w:rPr>
+                  <w:rStyle w:val="Hyperlink"/>
+                </w:rPr>
+                <w:t xml:space="preserve"> </w:t>
+              </w:r>
+              <w:proofErr w:type="spellStart"/>
+              <w:r>
+                <w:rPr>
+                  <w:rStyle w:val="Hyperlink"/>
+                </w:rPr>
+                <w:t>exceptions</w:t>
+              </w:r>
+              <w:proofErr w:type="spellEnd"/>
             </w:hyperlink>
           </w:p>
         </w:tc>
@@ -3853,9 +4564,11 @@
             <w:r>
               <w:t xml:space="preserve">Wie man eigene </w:t>
             </w:r>
+            <w:proofErr w:type="spellStart"/>
             <w:r>
               <w:t>Exceptions</w:t>
             </w:r>
+            <w:proofErr w:type="spellEnd"/>
             <w:r>
               <w:t xml:space="preserve"> erstellt in PHP</w:t>
             </w:r>
@@ -3868,13 +4581,49 @@
             <w:tcW w:w="4673" w:type="dxa"/>
           </w:tcPr>
           <w:p>
-            <w:hyperlink r:id="rId26" w:tgtFrame="_blank" w:tooltip="https://deepwiki.com/firebase/php-jwt/5-exception-handling" w:history="1">
+            <w:hyperlink r:id="rId27" w:tgtFrame="_blank" w:tooltip="https://deepwiki.com/firebase/php-jwt/5-exception-handling" w:history="1">
               <w:r>
                 <w:rPr>
                   <w:rStyle w:val="Hyperlink"/>
                 </w:rPr>
-                <w:t>Exception Handling | firebase/php-jwt | DeepWiki</w:t>
-              </w:r>
+                <w:t xml:space="preserve">Exception Handling | </w:t>
+              </w:r>
+              <w:proofErr w:type="spellStart"/>
+              <w:r>
+                <w:rPr>
+                  <w:rStyle w:val="Hyperlink"/>
+                </w:rPr>
+                <w:t>firebase</w:t>
+              </w:r>
+              <w:proofErr w:type="spellEnd"/>
+              <w:r>
+                <w:rPr>
+                  <w:rStyle w:val="Hyperlink"/>
+                </w:rPr>
+                <w:t>/</w:t>
+              </w:r>
+              <w:proofErr w:type="spellStart"/>
+              <w:r>
+                <w:rPr>
+                  <w:rStyle w:val="Hyperlink"/>
+                </w:rPr>
+                <w:t>php-jwt</w:t>
+              </w:r>
+              <w:proofErr w:type="spellEnd"/>
+              <w:r>
+                <w:rPr>
+                  <w:rStyle w:val="Hyperlink"/>
+                </w:rPr>
+                <w:t xml:space="preserve"> | </w:t>
+              </w:r>
+              <w:proofErr w:type="spellStart"/>
+              <w:r>
+                <w:rPr>
+                  <w:rStyle w:val="Hyperlink"/>
+                </w:rPr>
+                <w:t>DeepWiki</w:t>
+              </w:r>
+              <w:proofErr w:type="spellEnd"/>
             </w:hyperlink>
           </w:p>
         </w:tc>
@@ -3884,7 +4633,39 @@
           </w:tcPr>
           <w:p>
             <w:r>
-              <w:t>Mehr Exceptions für die firebase jwt libary, sodass man diese anschliessend Abfangen kann</w:t>
+              <w:t xml:space="preserve">Mehr </w:t>
+            </w:r>
+            <w:proofErr w:type="spellStart"/>
+            <w:r>
+              <w:t>Exceptions</w:t>
+            </w:r>
+            <w:proofErr w:type="spellEnd"/>
+            <w:r>
+              <w:t xml:space="preserve"> für die </w:t>
+            </w:r>
+            <w:proofErr w:type="spellStart"/>
+            <w:r>
+              <w:t>firebase</w:t>
+            </w:r>
+            <w:proofErr w:type="spellEnd"/>
+            <w:r>
+              <w:t xml:space="preserve"> </w:t>
+            </w:r>
+            <w:proofErr w:type="spellStart"/>
+            <w:r>
+              <w:t>jwt</w:t>
+            </w:r>
+            <w:proofErr w:type="spellEnd"/>
+            <w:r>
+              <w:t xml:space="preserve"> </w:t>
+            </w:r>
+            <w:proofErr w:type="spellStart"/>
+            <w:r>
+              <w:t>libary</w:t>
+            </w:r>
+            <w:proofErr w:type="spellEnd"/>
+            <w:r>
+              <w:t>, sodass man diese anschliessend Abfangen kann</w:t>
             </w:r>
           </w:p>
         </w:tc>
@@ -3895,7 +4676,7 @@
             <w:tcW w:w="4673" w:type="dxa"/>
           </w:tcPr>
           <w:p>
-            <w:hyperlink r:id="rId27" w:tgtFrame="_blank" w:tooltip="https://www.slimframework.com/docs/v4/concepts/middleware.html" w:history="1">
+            <w:hyperlink r:id="rId28" w:tgtFrame="_blank" w:tooltip="https://www.slimframework.com/docs/v4/concepts/middleware.html" w:history="1">
               <w:r>
                 <w:rPr>
                   <w:rStyle w:val="Hyperlink"/>
@@ -3922,7 +4703,7 @@
             <w:tcW w:w="4673" w:type="dxa"/>
           </w:tcPr>
           <w:p>
-            <w:hyperlink r:id="rId28" w:history="1">
+            <w:hyperlink r:id="rId29" w:history="1">
               <w:r>
                 <w:rPr>
                   <w:rStyle w:val="Hyperlink"/>
@@ -3950,13 +4731,29 @@
             <w:tcW w:w="4673" w:type="dxa"/>
           </w:tcPr>
           <w:p>
-            <w:hyperlink r:id="rId29" w:history="1">
+            <w:hyperlink r:id="rId30" w:history="1">
               <w:r>
                 <w:rPr>
                   <w:rStyle w:val="Hyperlink"/>
                   <w:lang w:val="en-CH"/>
                 </w:rPr>
-                <w:t>PHP-Cheatsheet (F4).pdf</w:t>
+                <w:t>PHP-</w:t>
+              </w:r>
+              <w:proofErr w:type="spellStart"/>
+              <w:r>
+                <w:rPr>
+                  <w:rStyle w:val="Hyperlink"/>
+                  <w:lang w:val="en-CH"/>
+                </w:rPr>
+                <w:t>Cheatsheet</w:t>
+              </w:r>
+              <w:proofErr w:type="spellEnd"/>
+              <w:r>
+                <w:rPr>
+                  <w:rStyle w:val="Hyperlink"/>
+                  <w:lang w:val="en-CH"/>
+                </w:rPr>
+                <w:t xml:space="preserve"> (F4).pdf</w:t>
               </w:r>
             </w:hyperlink>
           </w:p>
@@ -3968,6 +4765,47 @@
           <w:p>
             <w:r>
               <w:t>Generell wenn ich was nicht Wuste Syntax etc. ging Ichs dort nachschauen.</w:t>
+            </w:r>
+          </w:p>
+        </w:tc>
+      </w:tr>
+      <w:tr>
+        <w:tc>
+          <w:tcPr>
+            <w:tcW w:w="4673" w:type="dxa"/>
+          </w:tcPr>
+          <w:p>
+            <w:hyperlink r:id="rId31" w:history="1">
+              <w:r>
+                <w:rPr>
+                  <w:rStyle w:val="Hyperlink"/>
+                </w:rPr>
+                <w:t xml:space="preserve">PHP: </w:t>
+              </w:r>
+              <w:proofErr w:type="spellStart"/>
+              <w:r>
+                <w:rPr>
+                  <w:rStyle w:val="Hyperlink"/>
+                </w:rPr>
+                <w:t>round</w:t>
+              </w:r>
+              <w:proofErr w:type="spellEnd"/>
+              <w:r>
+                <w:rPr>
+                  <w:rStyle w:val="Hyperlink"/>
+                </w:rPr>
+                <w:t xml:space="preserve"> - Manual</w:t>
+              </w:r>
+            </w:hyperlink>
+          </w:p>
+        </w:tc>
+        <w:tc>
+          <w:tcPr>
+            <w:tcW w:w="4536" w:type="dxa"/>
+          </w:tcPr>
+          <w:p>
+            <w:r>
+              <w:t>Price Runden</w:t>
             </w:r>
           </w:p>
         </w:tc>
@@ -3975,8 +4813,8 @@
     </w:tbl>
     <w:p/>
     <w:sectPr>
-      <w:headerReference w:type="default" r:id="rId30"/>
-      <w:footerReference w:type="default" r:id="rId31"/>
+      <w:headerReference w:type="default" r:id="rId32"/>
+      <w:footerReference w:type="default" r:id="rId33"/>
       <w:pgSz w:w="11906" w:h="16838"/>
       <w:pgMar w:top="1417" w:right="1417" w:bottom="1134" w:left="1417" w:header="708" w:footer="708" w:gutter="0"/>
       <w:pgNumType w:start="0"/>
@@ -5431,6 +6269,7 @@
   </w:compat>
   <w:rsids>
     <w:rsidRoot w:val="002A6B0C"/>
+    <w:rsid w:val="0005461C"/>
     <w:rsid w:val="00086E71"/>
     <w:rsid w:val="000B0CE4"/>
     <w:rsid w:val="000C5381"/>
@@ -5444,6 +6283,7 @@
     <w:rsid w:val="004C145A"/>
     <w:rsid w:val="005B68F6"/>
     <w:rsid w:val="005E7911"/>
+    <w:rsid w:val="006225B5"/>
     <w:rsid w:val="006966EA"/>
     <w:rsid w:val="006D246E"/>
     <w:rsid w:val="008C45CC"/>
@@ -6425,7 +7265,12 @@
 </file>
 
 <file path=customXml/item3.xml><?xml version="1.0" encoding="utf-8"?>
-<b:Sources xmlns:b="http://schemas.openxmlformats.org/officeDocument/2006/bibliography" xmlns="http://schemas.openxmlformats.org/officeDocument/2006/bibliography" SelectedStyle="\APASixthEditionOfficeOnline.xsl" StyleName="APA" Version="6"/>
+<?mso-contentType ?>
+<FormTemplates xmlns="http://schemas.microsoft.com/sharepoint/v3/contenttype/forms">
+  <Display>DocumentLibraryForm</Display>
+  <Edit>DocumentLibraryForm</Edit>
+  <New>DocumentLibraryForm</New>
+</FormTemplates>
 </file>
 
 <file path=customXml/item4.xml><?xml version="1.0" encoding="utf-8"?>
@@ -6437,12 +7282,7 @@
 </file>
 
 <file path=customXml/item5.xml><?xml version="1.0" encoding="utf-8"?>
-<?mso-contentType ?>
-<FormTemplates xmlns="http://schemas.microsoft.com/sharepoint/v3/contenttype/forms">
-  <Display>DocumentLibraryForm</Display>
-  <Edit>DocumentLibraryForm</Edit>
-  <New>DocumentLibraryForm</New>
-</FormTemplates>
+<b:Sources xmlns:b="http://schemas.openxmlformats.org/officeDocument/2006/bibliography" xmlns="http://schemas.openxmlformats.org/officeDocument/2006/bibliography" SelectedStyle="\APASixthEditionOfficeOnline.xsl" StyleName="APA" Version="6"/>
 </file>
 
 <file path=customXml/itemProps1.xml><?xml version="1.0" encoding="utf-8"?>
@@ -6472,9 +7312,9 @@
 </file>
 
 <file path=customXml/itemProps3.xml><?xml version="1.0" encoding="utf-8"?>
-<ds:datastoreItem xmlns:ds="http://schemas.openxmlformats.org/officeDocument/2006/customXml" ds:itemID="{085B0882-36B4-42CD-B509-166A490B4C01}">
+<ds:datastoreItem xmlns:ds="http://schemas.openxmlformats.org/officeDocument/2006/customXml" ds:itemID="{EF9F3E54-D6B3-44CA-8BAC-523302A9CBB3}">
   <ds:schemaRefs>
-    <ds:schemaRef ds:uri="http://schemas.openxmlformats.org/officeDocument/2006/bibliography"/>
+    <ds:schemaRef ds:uri="http://schemas.microsoft.com/sharepoint/v3/contenttype/forms"/>
   </ds:schemaRefs>
 </ds:datastoreItem>
 </file>
@@ -6490,9 +7330,9 @@
 </file>
 
 <file path=customXml/itemProps5.xml><?xml version="1.0" encoding="utf-8"?>
-<ds:datastoreItem xmlns:ds="http://schemas.openxmlformats.org/officeDocument/2006/customXml" ds:itemID="{EF9F3E54-D6B3-44CA-8BAC-523302A9CBB3}">
+<ds:datastoreItem xmlns:ds="http://schemas.openxmlformats.org/officeDocument/2006/customXml" ds:itemID="{085B0882-36B4-42CD-B509-166A490B4C01}">
   <ds:schemaRefs>
-    <ds:schemaRef ds:uri="http://schemas.microsoft.com/sharepoint/v3/contenttype/forms"/>
+    <ds:schemaRef ds:uri="http://schemas.openxmlformats.org/officeDocument/2006/bibliography"/>
   </ds:schemaRefs>
 </ds:datastoreItem>
 </file>
</xml_diff>

<commit_message>
feat: Implemented Open Api Documentation and fixed validation in category service
</commit_message>
<xml_diff>
--- a/documentation/Documentation.docx
+++ b/documentation/Documentation.docx
@@ -281,7 +281,7 @@
                                   <w:tag w:val=""/>
                                   <w:id w:val="197127006"/>
                                   <w:dataBinding w:prefixMappings="xmlns:ns0='http://schemas.microsoft.com/office/2006/coverPageProps' " w:xpath="/ns0:CoverPageProperties[1]/ns0:PublishDate[1]" w:storeItemID="{55AF091B-3C7A-41E3-B477-F2FDAA23CFDA}"/>
-                                  <w:date w:fullDate="2026-06-12T00:00:00Z">
+                                  <w:date>
                                     <w:dateFormat w:val="d. MMMM yyyy"/>
                                     <w:lid w:val="de-DE"/>
                                     <w:storeMappedDataAs w:val="dateTime"/>
@@ -308,7 +308,7 @@
                                         <w:sz w:val="28"/>
                                         <w:szCs w:val="28"/>
                                       </w:rPr>
-                                      <w:t>12.</w:t>
+                                      <w:t>9</w:t>
                                     </w:r>
                                     <w:r>
                                       <w:rPr>
@@ -317,7 +317,34 @@
                                         <w:sz w:val="28"/>
                                         <w:szCs w:val="28"/>
                                       </w:rPr>
-                                      <w:t xml:space="preserve"> Juni 2026</w:t>
+                                      <w:t>.</w:t>
+                                    </w:r>
+                                    <w:r>
+                                      <w:rPr>
+                                        <w:caps/>
+                                        <w:color w:val="156082" w:themeColor="accent1"/>
+                                        <w:sz w:val="28"/>
+                                        <w:szCs w:val="28"/>
+                                      </w:rPr>
+                                      <w:t xml:space="preserve"> </w:t>
+                                    </w:r>
+                                    <w:r>
+                                      <w:rPr>
+                                        <w:caps/>
+                                        <w:color w:val="156082" w:themeColor="accent1"/>
+                                        <w:sz w:val="28"/>
+                                        <w:szCs w:val="28"/>
+                                      </w:rPr>
+                                      <w:t>oktober</w:t>
+                                    </w:r>
+                                    <w:r>
+                                      <w:rPr>
+                                        <w:caps/>
+                                        <w:color w:val="156082" w:themeColor="accent1"/>
+                                        <w:sz w:val="28"/>
+                                        <w:szCs w:val="28"/>
+                                      </w:rPr>
+                                      <w:t xml:space="preserve"> 2026</w:t>
                                     </w:r>
                                   </w:p>
                                 </w:sdtContent>
@@ -421,7 +448,7 @@
                             <w:tag w:val=""/>
                             <w:id w:val="197127006"/>
                             <w:dataBinding w:prefixMappings="xmlns:ns0='http://schemas.microsoft.com/office/2006/coverPageProps' " w:xpath="/ns0:CoverPageProperties[1]/ns0:PublishDate[1]" w:storeItemID="{55AF091B-3C7A-41E3-B477-F2FDAA23CFDA}"/>
-                            <w:date w:fullDate="2026-06-12T00:00:00Z">
+                            <w:date>
                               <w:dateFormat w:val="d. MMMM yyyy"/>
                               <w:lid w:val="de-DE"/>
                               <w:storeMappedDataAs w:val="dateTime"/>
@@ -448,7 +475,7 @@
                                   <w:sz w:val="28"/>
                                   <w:szCs w:val="28"/>
                                 </w:rPr>
-                                <w:t>12.</w:t>
+                                <w:t>9</w:t>
                               </w:r>
                               <w:r>
                                 <w:rPr>
@@ -457,7 +484,34 @@
                                   <w:sz w:val="28"/>
                                   <w:szCs w:val="28"/>
                                 </w:rPr>
-                                <w:t xml:space="preserve"> Juni 2026</w:t>
+                                <w:t>.</w:t>
+                              </w:r>
+                              <w:r>
+                                <w:rPr>
+                                  <w:caps/>
+                                  <w:color w:val="156082" w:themeColor="accent1"/>
+                                  <w:sz w:val="28"/>
+                                  <w:szCs w:val="28"/>
+                                </w:rPr>
+                                <w:t xml:space="preserve"> </w:t>
+                              </w:r>
+                              <w:r>
+                                <w:rPr>
+                                  <w:caps/>
+                                  <w:color w:val="156082" w:themeColor="accent1"/>
+                                  <w:sz w:val="28"/>
+                                  <w:szCs w:val="28"/>
+                                </w:rPr>
+                                <w:t>oktober</w:t>
+                              </w:r>
+                              <w:r>
+                                <w:rPr>
+                                  <w:caps/>
+                                  <w:color w:val="156082" w:themeColor="accent1"/>
+                                  <w:sz w:val="28"/>
+                                  <w:szCs w:val="28"/>
+                                </w:rPr>
+                                <w:t xml:space="preserve"> 2026</w:t>
                               </w:r>
                             </w:p>
                           </w:sdtContent>
@@ -1504,6 +1558,7 @@
               <w:t>product</w:t>
             </w:r>
             <w:proofErr w:type="spellEnd"/>
+            <w:proofErr w:type="gramStart"/>
             <w:r>
               <w:t>/</w:t>
             </w:r>
@@ -1518,6 +1573,7 @@
               <w:t>sku</w:t>
             </w:r>
             <w:proofErr w:type="spellEnd"/>
+            <w:proofErr w:type="gramEnd"/>
             <w:r>
               <w:t xml:space="preserve"> </w:t>
             </w:r>
@@ -1707,6 +1763,7 @@
               <w:t>product</w:t>
             </w:r>
             <w:proofErr w:type="spellEnd"/>
+            <w:proofErr w:type="gramStart"/>
             <w:r>
               <w:t>/</w:t>
             </w:r>
@@ -1721,6 +1778,7 @@
               <w:t>sku</w:t>
             </w:r>
             <w:proofErr w:type="spellEnd"/>
+            <w:proofErr w:type="gramEnd"/>
             <w:r>
               <w:t xml:space="preserve"> </w:t>
             </w:r>
@@ -2455,6 +2513,7 @@
                 <w:t xml:space="preserve">PHP: </w:t>
               </w:r>
               <w:proofErr w:type="spellStart"/>
+              <w:proofErr w:type="gramStart"/>
               <w:r>
                 <w:rPr>
                   <w:rStyle w:val="Hyperlink"/>
@@ -2466,7 +2525,14 @@
                 <w:rPr>
                   <w:rStyle w:val="Hyperlink"/>
                 </w:rPr>
-                <w:t>::$</w:t>
+                <w:t>::</w:t>
+              </w:r>
+              <w:proofErr w:type="gramEnd"/>
+              <w:r>
+                <w:rPr>
+                  <w:rStyle w:val="Hyperlink"/>
+                </w:rPr>
+                <w:t>$</w:t>
               </w:r>
               <w:proofErr w:type="spellStart"/>
               <w:r>
@@ -3615,7 +3681,23 @@
           </w:p>
           <w:p>
             <w:r>
-              <w:t>Es war ein Sehr erfolgreichen Tag, Das meiste des Projekts wurde abgeschlossen sodass am letzten Projekt tag nur noch die Dokumentation angepasst werden muss.</w:t>
+              <w:t xml:space="preserve">Es war ein </w:t>
+            </w:r>
+            <w:proofErr w:type="gramStart"/>
+            <w:r>
+              <w:t>Sehr</w:t>
+            </w:r>
+            <w:proofErr w:type="gramEnd"/>
+            <w:r>
+              <w:t xml:space="preserve"> erfolgreichen Tag, Das meiste des Projekts wurde </w:t>
+            </w:r>
+            <w:proofErr w:type="gramStart"/>
+            <w:r>
+              <w:t>abgeschlossen</w:t>
+            </w:r>
+            <w:proofErr w:type="gramEnd"/>
+            <w:r>
+              <w:t xml:space="preserve"> sodass am letzten Projekt tag nur noch die Dokumentation angepasst werden muss.</w:t>
             </w:r>
           </w:p>
         </w:tc>
@@ -4319,6 +4401,7 @@
                 <w:t xml:space="preserve">PHP: </w:t>
               </w:r>
               <w:proofErr w:type="spellStart"/>
+              <w:proofErr w:type="gramStart"/>
               <w:r>
                 <w:rPr>
                   <w:rStyle w:val="Hyperlink"/>
@@ -4330,7 +4413,14 @@
                 <w:rPr>
                   <w:rStyle w:val="Hyperlink"/>
                 </w:rPr>
-                <w:t>::$</w:t>
+                <w:t>::</w:t>
+              </w:r>
+              <w:proofErr w:type="gramEnd"/>
+              <w:r>
+                <w:rPr>
+                  <w:rStyle w:val="Hyperlink"/>
+                </w:rPr>
+                <w:t>$</w:t>
               </w:r>
               <w:proofErr w:type="spellStart"/>
               <w:r>
@@ -5633,6 +5723,7 @@
   <w:style w:type="character" w:default="1" w:styleId="DefaultParagraphFont">
     <w:name w:val="Default Paragraph Font"/>
     <w:uiPriority w:val="1"/>
+    <w:semiHidden/>
     <w:unhideWhenUsed/>
   </w:style>
   <w:style w:type="table" w:default="1" w:styleId="TableNormal">
@@ -6274,6 +6365,7 @@
     <w:rsid w:val="000B0CE4"/>
     <w:rsid w:val="000C5381"/>
     <w:rsid w:val="00141966"/>
+    <w:rsid w:val="001A102F"/>
     <w:rsid w:val="001C208D"/>
     <w:rsid w:val="00295579"/>
     <w:rsid w:val="002A6B0C"/>
@@ -6292,6 +6384,7 @@
     <w:rsid w:val="00A66BBA"/>
     <w:rsid w:val="00C21528"/>
     <w:rsid w:val="00CA5AF9"/>
+    <w:rsid w:val="00DC794B"/>
     <w:rsid w:val="00EC5C99"/>
     <w:rsid w:val="00F6483E"/>
   </w:rsids>
@@ -7079,7 +7172,7 @@
 
 <file path=customXml/item1.xml><?xml version="1.0" encoding="utf-8"?>
 <CoverPageProperties xmlns="http://schemas.microsoft.com/office/2006/coverPageProps">
-  <PublishDate>2026-06-12T00:00:00</PublishDate>
+  <PublishDate>9. oktober 2026</PublishDate>
   <Abstract/>
   <CompanyAddress/>
   <CompanyPhone/>
@@ -7265,12 +7358,7 @@
 </file>
 
 <file path=customXml/item3.xml><?xml version="1.0" encoding="utf-8"?>
-<?mso-contentType ?>
-<FormTemplates xmlns="http://schemas.microsoft.com/sharepoint/v3/contenttype/forms">
-  <Display>DocumentLibraryForm</Display>
-  <Edit>DocumentLibraryForm</Edit>
-  <New>DocumentLibraryForm</New>
-</FormTemplates>
+<b:Sources xmlns:b="http://schemas.openxmlformats.org/officeDocument/2006/bibliography" xmlns="http://schemas.openxmlformats.org/officeDocument/2006/bibliography" SelectedStyle="\APASixthEditionOfficeOnline.xsl" StyleName="APA" Version="6"/>
 </file>
 
 <file path=customXml/item4.xml><?xml version="1.0" encoding="utf-8"?>
@@ -7282,7 +7370,12 @@
 </file>
 
 <file path=customXml/item5.xml><?xml version="1.0" encoding="utf-8"?>
-<b:Sources xmlns:b="http://schemas.openxmlformats.org/officeDocument/2006/bibliography" xmlns="http://schemas.openxmlformats.org/officeDocument/2006/bibliography" SelectedStyle="\APASixthEditionOfficeOnline.xsl" StyleName="APA" Version="6"/>
+<?mso-contentType ?>
+<FormTemplates xmlns="http://schemas.microsoft.com/sharepoint/v3/contenttype/forms">
+  <Display>DocumentLibraryForm</Display>
+  <Edit>DocumentLibraryForm</Edit>
+  <New>DocumentLibraryForm</New>
+</FormTemplates>
 </file>
 
 <file path=customXml/itemProps1.xml><?xml version="1.0" encoding="utf-8"?>
@@ -7312,9 +7405,9 @@
 </file>
 
 <file path=customXml/itemProps3.xml><?xml version="1.0" encoding="utf-8"?>
-<ds:datastoreItem xmlns:ds="http://schemas.openxmlformats.org/officeDocument/2006/customXml" ds:itemID="{EF9F3E54-D6B3-44CA-8BAC-523302A9CBB3}">
+<ds:datastoreItem xmlns:ds="http://schemas.openxmlformats.org/officeDocument/2006/customXml" ds:itemID="{085B0882-36B4-42CD-B509-166A490B4C01}">
   <ds:schemaRefs>
-    <ds:schemaRef ds:uri="http://schemas.microsoft.com/sharepoint/v3/contenttype/forms"/>
+    <ds:schemaRef ds:uri="http://schemas.openxmlformats.org/officeDocument/2006/bibliography"/>
   </ds:schemaRefs>
 </ds:datastoreItem>
 </file>
@@ -7330,9 +7423,9 @@
 </file>
 
 <file path=customXml/itemProps5.xml><?xml version="1.0" encoding="utf-8"?>
-<ds:datastoreItem xmlns:ds="http://schemas.openxmlformats.org/officeDocument/2006/customXml" ds:itemID="{085B0882-36B4-42CD-B509-166A490B4C01}">
+<ds:datastoreItem xmlns:ds="http://schemas.openxmlformats.org/officeDocument/2006/customXml" ds:itemID="{EF9F3E54-D6B3-44CA-8BAC-523302A9CBB3}">
   <ds:schemaRefs>
-    <ds:schemaRef ds:uri="http://schemas.openxmlformats.org/officeDocument/2006/bibliography"/>
+    <ds:schemaRef ds:uri="http://schemas.microsoft.com/sharepoint/v3/contenttype/forms"/>
   </ds:schemaRefs>
 </ds:datastoreItem>
 </file>
</xml_diff>